<commit_message>
docs: rescope ECN draft to the connector system only
Items A-C (BOM correction, pre-fitted screws/orientation, pre-drilled
holes); the leg pre-assembly moves to a noted follow-on ECN. Drop the
HTML version - the editable Word doc is the working draft.

Co-Authored-By: Claude Opus 4.8 <noreply@anthropic.com>
Claude-Session: https://claude.ai/code/session_019MdxDfxB8wg2Ht2aZSuwqK
</commit_message>
<xml_diff>
--- a/standard-work/docs/ECN_Meritage_Connectors_DRAFT.docx
+++ b/standard-work/docs/ECN_Meritage_Connectors_DRAFT.docx
@@ -26,11 +26,10 @@
       </w:pPr>
       <w:r>
         <w:rPr>
-          <w:i w:val="0"/>
           <w:color w:val="5A6672"/>
           <w:sz w:val="18"/>
         </w:rPr>
-        <w:t>TUUCI — Meritage product family · Prepared from the Meritage 3-Seater Engineering Improvement Plan (06/18/2026)</w:t>
+        <w:t>TUUCI — Meritage product family · Scope: FLAT CONNECTOR SYSTEM · Prepared from the Meritage 3-Seater Engineering Improvement Plan (06/18/2026)</w:t>
       </w:r>
     </w:p>
     <w:tbl>
@@ -56,7 +55,6 @@
             <w:r>
               <w:rPr>
                 <w:b/>
-                <w:i w:val="0"/>
                 <w:color w:val="5A6672"/>
                 <w:sz w:val="17"/>
               </w:rPr>
@@ -73,7 +71,6 @@
             <w:r>
               <w:rPr>
                 <w:b w:val="0"/>
-                <w:i w:val="0"/>
               </w:rPr>
               <w:t>ECN-2026-____ (assigned on release)</w:t>
             </w:r>
@@ -89,7 +86,6 @@
             <w:r>
               <w:rPr>
                 <w:b/>
-                <w:i w:val="0"/>
                 <w:color w:val="5A6672"/>
                 <w:sz w:val="17"/>
               </w:rPr>
@@ -106,7 +102,6 @@
             <w:r>
               <w:rPr>
                 <w:b w:val="0"/>
-                <w:i w:val="0"/>
               </w:rPr>
               <w:t>07/13/2026</w:t>
             </w:r>
@@ -124,7 +119,6 @@
             <w:r>
               <w:rPr>
                 <w:b/>
-                <w:i w:val="0"/>
                 <w:color w:val="5A6672"/>
                 <w:sz w:val="17"/>
               </w:rPr>
@@ -141,7 +135,6 @@
             <w:r>
               <w:rPr>
                 <w:b w:val="0"/>
-                <w:i w:val="0"/>
               </w:rPr>
               <w:t>Douglas O'Keefe — Continuous Improvement</w:t>
             </w:r>
@@ -157,7 +150,6 @@
             <w:r>
               <w:rPr>
                 <w:b/>
-                <w:i w:val="0"/>
                 <w:color w:val="5A6672"/>
                 <w:sz w:val="17"/>
               </w:rPr>
@@ -174,7 +166,6 @@
             <w:r>
               <w:rPr>
                 <w:b w:val="0"/>
-                <w:i w:val="0"/>
               </w:rPr>
               <w:t>Major — BOM, drawings, supplier process</w:t>
             </w:r>
@@ -192,7 +183,6 @@
             <w:r>
               <w:rPr>
                 <w:b/>
-                <w:i w:val="0"/>
                 <w:color w:val="5A6672"/>
                 <w:sz w:val="17"/>
               </w:rPr>
@@ -210,9 +200,8 @@
             <w:r>
               <w:rPr>
                 <w:b w:val="0"/>
-                <w:i w:val="0"/>
               </w:rPr>
-              <w:t>Meritage 3-Seater Sofa (primary). Connector system is shared across Meritage lines — all Meritage SKUs using flat horizontal connectors are affected.</w:t>
+              <w:t>Meritage 3-Seater Sofa (primary). The flat connector system is shared across Meritage lines — all Meritage SKUs using these connectors are affected.</w:t>
             </w:r>
           </w:p>
         </w:tc>
@@ -228,7 +217,6 @@
             <w:r>
               <w:rPr>
                 <w:b/>
-                <w:i w:val="0"/>
                 <w:color w:val="5A6672"/>
                 <w:sz w:val="17"/>
               </w:rPr>
@@ -245,9 +233,8 @@
             <w:r>
               <w:rPr>
                 <w:b w:val="0"/>
-                <w:i w:val="0"/>
               </w:rPr>
-              <w:t>High — recovers ~24 min labor/unit; two items relieve the seat-frame bottleneck</w:t>
+              <w:t>High — recovers ~16–18 min labor/unit; pre-drilling relieves the seat-frame bottleneck directly</w:t>
             </w:r>
           </w:p>
         </w:tc>
@@ -261,7 +248,6 @@
             <w:r>
               <w:rPr>
                 <w:b/>
-                <w:i w:val="0"/>
                 <w:color w:val="5A6672"/>
                 <w:sz w:val="17"/>
               </w:rPr>
@@ -278,7 +264,6 @@
             <w:r>
               <w:rPr>
                 <w:b w:val="0"/>
-                <w:i w:val="0"/>
               </w:rPr>
               <w:t>First supplier PO after approval (date: ____)</w:t>
             </w:r>
@@ -307,10 +292,7 @@
         <w:spacing w:after="120"/>
       </w:pPr>
       <w:r>
-        <w:rPr>
-          <w:i w:val="0"/>
-        </w:rPr>
-        <w:t>Meritage flat connectors arrive from the Vietnam supplier as one generic configuration and are hand-reworked on the line before use (screw swaps, orientation flips, hole drilling), and the high-volume leg piece is assembled in-house. This adds ~24 minutes of non-value-added labor per unit, part of it directly on the seat-frame bottleneck, so every minute recovered there raises line throughput — not just labor. Root cause is a BOM/documentation gap: three real connector configurations exist but the BOM lists only two, and the connector CAD drawings carry an incorrect part number, so the supplier cannot ship parts pre-configured.</w:t>
+        <w:t>Meritage flat connectors arrive from the Vietnam supplier as one generic configuration and are hand-reworked on the line before every use: wrong screws are swapped out, half of the back connectors are re-oriented by hand, and leg-insertion holes are drilled during seat-frame assembly — the line's top bottleneck. This is ~16–18 minutes of non-value-added labor per unit, and the drilling portion caps line throughput. Root cause is a BOM/documentation gap: three real connector configurations exist, but the BOM lists only two, and the connector CAD drawings carry an incorrect part number (1012553) — so the supplier has no way to ship parts pre-configured.</w:t>
       </w:r>
     </w:p>
     <w:p>
@@ -338,7 +320,7 @@
           <w:b/>
           <w:sz w:val="22"/>
         </w:rPr>
-        <w:t>Item A — Correct the connector BOM (3 configurations, unique part numbers) — prerequisite for B–D</w:t>
+        <w:t>Item A — Correct the connector BOM: 3 configurations, unique part numbers (prerequisite for B and C)</w:t>
       </w:r>
     </w:p>
     <w:tbl>
@@ -362,7 +344,6 @@
             <w:r>
               <w:rPr>
                 <w:b/>
-                <w:i w:val="0"/>
                 <w:color w:val="5A6672"/>
                 <w:sz w:val="17"/>
               </w:rPr>
@@ -380,7 +361,6 @@
             <w:r>
               <w:rPr>
                 <w:b/>
-                <w:i w:val="0"/>
                 <w:color w:val="5A6672"/>
                 <w:sz w:val="17"/>
               </w:rPr>
@@ -399,9 +379,8 @@
             <w:r>
               <w:rPr>
                 <w:b w:val="0"/>
-                <w:i w:val="0"/>
               </w:rPr>
-              <w:t>BOM lists 2 connector types; all arrive as one generic design. Connector CAD drawings show P/N 1012553, which matches neither the BOM nor the floor. Two configurations share a part number.</w:t>
+              <w:t>BOM lists 2 connector types; all arrive as one generic design. Connector CAD drawings show P/N 1012553, which matches neither the BOM nor the floor. The two back configurations (left/right) share a part number.</w:t>
             </w:r>
           </w:p>
         </w:tc>
@@ -414,9 +393,8 @@
             <w:r>
               <w:rPr>
                 <w:b w:val="0"/>
-                <w:i w:val="0"/>
               </w:rPr>
-              <w:t>BOM and connector CAD drawings list 3 unique configurations with their own P/Ns:</w:t>
+              <w:t>BOM and connector CAD drawings list 3 unique configurations, each with its own P/N:</w:t>
               <w:br/>
               <w:t>• Front (same both sides): 1015301 — qty 2</w:t>
               <w:br/>
@@ -424,7 +402,7 @@
               <w:br/>
               <w:t>• Back-right: 1016592 — qty 1</w:t>
               <w:br/>
-              <w:t>Update connector drawings to the correct P/Ns and configurations (left/right defined).</w:t>
+              <w:t>Update the connector drawings to the correct P/Ns, with the left and right configurations explicitly defined.</w:t>
             </w:r>
           </w:p>
         </w:tc>
@@ -436,11 +414,10 @@
       </w:pPr>
       <w:r>
         <w:rPr>
-          <w:i w:val="0"/>
           <w:color w:val="5A6672"/>
           <w:sz w:val="18"/>
         </w:rPr>
-        <w:t>Reference: the seat-frame assembly drawing already shows all three P/Ns correctly (1015301 ×2 front, 1015302 + 1016592 back); drawing TU-530 Rev A likewise BOMs the three connector assemblies separately (Config 1/2/3). Only the BOM and the connector-level drawings lag.</w:t>
+        <w:t>Supporting evidence: the seat-frame assembly drawing already shows all three P/Ns correctly (1015301 ×2 front, 1015302 + 1016592 back), and drawing TU-530 Rev A BOMs the three connector assemblies separately (ASSY MER HORZ CONNECTOR Config 1 / 2 / 3). Only the product BOM and the connector-level drawings lag reality.</w:t>
       </w:r>
     </w:p>
     <w:p>
@@ -452,7 +429,7 @@
           <w:b/>
           <w:sz w:val="22"/>
         </w:rPr>
-        <w:t>Item B — Eliminate screw swaps &amp; reorientation (ship pre-configured)</w:t>
+        <w:t>Item B — Ship connectors pre-configured: correct screw, correct orientation</w:t>
       </w:r>
     </w:p>
     <w:tbl>
@@ -476,7 +453,6 @@
             <w:r>
               <w:rPr>
                 <w:b/>
-                <w:i w:val="0"/>
                 <w:color w:val="5A6672"/>
                 <w:sz w:val="17"/>
               </w:rPr>
@@ -494,7 +470,6 @@
             <w:r>
               <w:rPr>
                 <w:b/>
-                <w:i w:val="0"/>
                 <w:color w:val="5A6672"/>
                 <w:sz w:val="17"/>
               </w:rPr>
@@ -513,9 +488,8 @@
             <w:r>
               <w:rPr>
                 <w:b w:val="0"/>
-                <w:i w:val="0"/>
               </w:rPr>
-              <w:t>Type 1 (front) arrives with screw 40200; operator removes it and installs 1012919 on every connector. Type 2 (back) arrives with 1012934; operator swaps to 40204. Half of Type 2 also need the screw-entry side flipped by hand. Rework ≈ 11 min 40 s per unit, zero value added.</w:t>
+              <w:t>Type 1 (front) arrives with screw 40200; the operator removes it and installs 1012919 — on every single connector. Type 2 (back) arrives with 1012934; the operator swaps it for 40204. Half of the Type 2 connectors also need the screw-entry side flipped by hand. Total rework ≈ 11 min 40 s per unit, zero value added.</w:t>
             </w:r>
           </w:p>
         </w:tc>
@@ -528,15 +502,14 @@
             <w:r>
               <w:rPr>
                 <w:b w:val="0"/>
-                <w:i w:val="0"/>
               </w:rPr>
               <w:t>Each configuration ships from the supplier already fitted with the correct screw and orientation:</w:t>
               <w:br/>
-              <w:t>• 1015301 with 1012919</w:t>
+              <w:t>• 1015301 fitted with 1012919</w:t>
               <w:br/>
-              <w:t>• 1015302 / 1016592 with 40204, left/right orientation per drawing</w:t>
+              <w:t>• 1015302 / 1016592 fitted with 40204, left/right orientation per the updated drawings</w:t>
               <w:br/>
-              <w:t>Screw specs to be validated by Engineering before release (see §6).</w:t>
+              <w:t>Screw part numbers to be validated by Engineering before release (see §6).</w:t>
             </w:r>
           </w:p>
         </w:tc>
@@ -551,7 +524,7 @@
           <w:b/>
           <w:sz w:val="22"/>
         </w:rPr>
-        <w:t>Item C — Pre-drill connector holes for leg insertion (bottleneck relief)</w:t>
+        <w:t>Item C — Pre-drill the leg-insertion holes (bottleneck relief)</w:t>
       </w:r>
     </w:p>
     <w:tbl>
@@ -575,7 +548,6 @@
             <w:r>
               <w:rPr>
                 <w:b/>
-                <w:i w:val="0"/>
                 <w:color w:val="5A6672"/>
                 <w:sz w:val="17"/>
               </w:rPr>
@@ -593,7 +565,6 @@
             <w:r>
               <w:rPr>
                 <w:b/>
-                <w:i w:val="0"/>
                 <w:color w:val="5A6672"/>
                 <w:sz w:val="17"/>
               </w:rPr>
@@ -612,9 +583,8 @@
             <w:r>
               <w:rPr>
                 <w:b w:val="0"/>
-                <w:i w:val="0"/>
               </w:rPr>
-              <w:t>Operators manually drill 4 holes into the flat connectors for leg-piece insertion during seat-frame assembly — the line's top bottleneck. ≥ 5 min per frame.</w:t>
+              <w:t>Operators manually drill 4 holes into the flat connectors for leg-piece insertion during seat-frame assembly — the top bottleneck of the line. ≥ 5 min per frame, taken directly from the constraint.</w:t>
             </w:r>
           </w:p>
         </w:tc>
@@ -627,102 +597,8 @@
             <w:r>
               <w:rPr>
                 <w:b w:val="0"/>
-                <w:i w:val="0"/>
               </w:rPr>
-              <w:t>Connectors arrive with leg-insertion holes pre-drilled per drawing (hole size/position to be added to the updated connector drawings in Item A).</w:t>
-            </w:r>
-          </w:p>
-        </w:tc>
-      </w:tr>
-    </w:tbl>
-    <w:p>
-      <w:pPr>
-        <w:spacing w:before="200" w:after="40"/>
-      </w:pPr>
-      <w:r>
-        <w:rPr>
-          <w:b/>
-          <w:sz w:val="22"/>
-        </w:rPr>
-        <w:t>Item D — Receive the high-volume leg piece pre-assembled</w:t>
-      </w:r>
-    </w:p>
-    <w:tbl>
-      <w:tblPr>
-        <w:tblStyle w:val="TableGrid"/>
-        <w:tblW w:type="auto" w:w="0"/>
-        <w:tblLook w:firstColumn="1" w:firstRow="1" w:lastColumn="0" w:lastRow="0" w:noHBand="0" w:noVBand="1" w:val="04A0"/>
-      </w:tblPr>
-      <w:tblGrid>
-        <w:gridCol w:w="5040"/>
-        <w:gridCol w:w="5040"/>
-      </w:tblGrid>
-      <w:tr>
-        <w:tc>
-          <w:tcPr>
-            <w:tcW w:type="dxa" w:w="5112"/>
-            <w:shd w:val="clear" w:fill="EEF2F7"/>
-          </w:tcPr>
-          <w:p>
-            <w:r/>
-            <w:r>
-              <w:rPr>
-                <w:b/>
-                <w:i w:val="0"/>
-                <w:color w:val="5A6672"/>
-                <w:sz w:val="17"/>
-              </w:rPr>
-              <w:t>Current condition</w:t>
-            </w:r>
-          </w:p>
-        </w:tc>
-        <w:tc>
-          <w:tcPr>
-            <w:tcW w:type="dxa" w:w="5112"/>
-            <w:shd w:val="clear" w:fill="EEF2F7"/>
-          </w:tcPr>
-          <w:p>
-            <w:r/>
-            <w:r>
-              <w:rPr>
-                <w:b/>
-                <w:i w:val="0"/>
-                <w:color w:val="5A6672"/>
-                <w:sz w:val="17"/>
-              </w:rPr>
-              <w:t>Requested change</w:t>
-            </w:r>
-          </w:p>
-        </w:tc>
-      </w:tr>
-      <w:tr>
-        <w:tc>
-          <w:tcPr>
-            <w:tcW w:type="dxa" w:w="5112"/>
-          </w:tcPr>
-          <w:p>
-            <w:r/>
-            <w:r>
-              <w:rPr>
-                <w:b w:val="0"/>
-                <w:i w:val="0"/>
-              </w:rPr>
-              <w:t>Connector operator assembles the leg piece in-house, ~8 min per unit. Two variants exist; the basic (non-wheeled) variant is ~90% of volume.</w:t>
-            </w:r>
-          </w:p>
-        </w:tc>
-        <w:tc>
-          <w:tcPr>
-            <w:tcW w:type="dxa" w:w="5112"/>
-          </w:tcPr>
-          <w:p>
-            <w:r/>
-            <w:r>
-              <w:rPr>
-                <w:b w:val="0"/>
-                <w:i w:val="0"/>
-              </w:rPr>
-              <w:t>The basic leg piece arrives pre-assembled from the supplier under its own P/N (assign: ____). The wheeled variant (~10%) remains assembled in-house. Gate: supplier finish must meet TUUCI paint spec (see §6).</w:t>
+              <w:t>Connectors arrive with the 4 leg-insertion holes pre-drilled per drawing. Hole size and positions to be formalized on the updated connector drawings from Item A. Because this removes work from the bottleneck, every minute saved is direct throughput, not just labor.</w:t>
             </w:r>
           </w:p>
         </w:tc>
@@ -766,7 +642,6 @@
             <w:r>
               <w:rPr>
                 <w:b/>
-                <w:i w:val="0"/>
                 <w:color w:val="5A6672"/>
                 <w:sz w:val="17"/>
               </w:rPr>
@@ -784,7 +659,6 @@
             <w:r>
               <w:rPr>
                 <w:b/>
-                <w:i w:val="0"/>
                 <w:color w:val="5A6672"/>
                 <w:sz w:val="17"/>
               </w:rPr>
@@ -802,7 +676,6 @@
             <w:r>
               <w:rPr>
                 <w:b/>
-                <w:i w:val="0"/>
                 <w:color w:val="5A6672"/>
                 <w:sz w:val="17"/>
               </w:rPr>
@@ -821,7 +694,6 @@
             <w:r>
               <w:rPr>
                 <w:b w:val="0"/>
-                <w:i w:val="0"/>
               </w:rPr>
               <w:t>Meritage 3-Seater BOM (and shared-connector Meritage BOMs)</w:t>
             </w:r>
@@ -836,7 +708,6 @@
             <w:r>
               <w:rPr>
                 <w:b w:val="0"/>
-                <w:i w:val="0"/>
               </w:rPr>
               <w:t>BOM</w:t>
             </w:r>
@@ -851,9 +722,8 @@
             <w:r>
               <w:rPr>
                 <w:b w:val="0"/>
-                <w:i w:val="0"/>
               </w:rPr>
-              <w:t>2 connector types → 3 unique P/Ns (1015301 / 1015302 / 1016592) with quantities 2/1/1; add pre-assembled leg P/N</w:t>
+              <w:t>2 connector types → 3 unique P/Ns (1015301 / 1015302 / 1016592), quantities 2 / 1 / 1</w:t>
             </w:r>
           </w:p>
         </w:tc>
@@ -868,7 +738,6 @@
             <w:r>
               <w:rPr>
                 <w:b w:val="0"/>
-                <w:i w:val="0"/>
               </w:rPr>
               <w:t>Connector CAD drawing(s) currently P/N 1012553</w:t>
             </w:r>
@@ -883,7 +752,6 @@
             <w:r>
               <w:rPr>
                 <w:b w:val="0"/>
-                <w:i w:val="0"/>
               </w:rPr>
               <w:t>Drawing</w:t>
             </w:r>
@@ -898,7 +766,6 @@
             <w:r>
               <w:rPr>
                 <w:b w:val="0"/>
-                <w:i w:val="0"/>
               </w:rPr>
               <w:t>Correct P/Ns; define left/right configurations; add fitted-screw callouts; add pre-drilled leg-insertion holes (size, position, qty 4)</w:t>
             </w:r>
@@ -915,7 +782,6 @@
             <w:r>
               <w:rPr>
                 <w:b w:val="0"/>
-                <w:i w:val="0"/>
               </w:rPr>
               <w:t>Screws 40200, 1012934</w:t>
             </w:r>
@@ -930,7 +796,6 @@
             <w:r>
               <w:rPr>
                 <w:b w:val="0"/>
-                <w:i w:val="0"/>
               </w:rPr>
               <w:t>Component</w:t>
             </w:r>
@@ -945,9 +810,8 @@
             <w:r>
               <w:rPr>
                 <w:b w:val="0"/>
-                <w:i w:val="0"/>
               </w:rPr>
-              <w:t>Removed from connector configurations (superseded by 1012919 / 40204, pending validation)</w:t>
+              <w:t>Removed from connector configurations (superseded by 1012919 / 40204, pending Engineering validation)</w:t>
             </w:r>
           </w:p>
         </w:tc>
@@ -962,9 +826,8 @@
             <w:r>
               <w:rPr>
                 <w:b w:val="0"/>
-                <w:i w:val="0"/>
               </w:rPr>
-              <w:t>Basic leg piece</w:t>
+              <w:t>Supplier POs / work instructions (Vietnam)</w:t>
             </w:r>
           </w:p>
         </w:tc>
@@ -977,9 +840,8 @@
             <w:r>
               <w:rPr>
                 <w:b w:val="0"/>
-                <w:i w:val="0"/>
               </w:rPr>
-              <w:t>Part / sourcing</w:t>
+              <w:t>Procurement</w:t>
             </w:r>
           </w:p>
         </w:tc>
@@ -992,9 +854,8 @@
             <w:r>
               <w:rPr>
                 <w:b w:val="0"/>
-                <w:i w:val="0"/>
               </w:rPr>
-              <w:t>New pre-assembled P/N; supplier assembly + paint-spec qualification</w:t>
+              <w:t>Order by configuration P/N; pre-fit screws; pre-drill holes</w:t>
             </w:r>
           </w:p>
         </w:tc>
@@ -1009,54 +870,6 @@
             <w:r>
               <w:rPr>
                 <w:b w:val="0"/>
-                <w:i w:val="0"/>
-              </w:rPr>
-              <w:t>Supplier POs / work instructions (Vietnam)</w:t>
-            </w:r>
-          </w:p>
-        </w:tc>
-        <w:tc>
-          <w:tcPr>
-            <w:tcW w:type="dxa" w:w="3408"/>
-          </w:tcPr>
-          <w:p>
-            <w:r/>
-            <w:r>
-              <w:rPr>
-                <w:b w:val="0"/>
-                <w:i w:val="0"/>
-              </w:rPr>
-              <w:t>Procurement</w:t>
-            </w:r>
-          </w:p>
-        </w:tc>
-        <w:tc>
-          <w:tcPr>
-            <w:tcW w:type="dxa" w:w="3408"/>
-          </w:tcPr>
-          <w:p>
-            <w:r/>
-            <w:r>
-              <w:rPr>
-                <w:b w:val="0"/>
-                <w:i w:val="0"/>
-              </w:rPr>
-              <w:t>Order by configuration P/N; pre-fit screws; pre-drill holes; leg pre-assembly</w:t>
-            </w:r>
-          </w:p>
-        </w:tc>
-      </w:tr>
-      <w:tr>
-        <w:tc>
-          <w:tcPr>
-            <w:tcW w:type="dxa" w:w="3408"/>
-          </w:tcPr>
-          <w:p>
-            <w:r/>
-            <w:r>
-              <w:rPr>
-                <w:b w:val="0"/>
-                <w:i w:val="0"/>
               </w:rPr>
               <w:t>Line SWI — connector prep &amp; seat-frame stations</w:t>
             </w:r>
@@ -1071,7 +884,6 @@
             <w:r>
               <w:rPr>
                 <w:b w:val="0"/>
-                <w:i w:val="0"/>
               </w:rPr>
               <w:t>Standard work</w:t>
             </w:r>
@@ -1086,9 +898,8 @@
             <w:r>
               <w:rPr>
                 <w:b w:val="0"/>
-                <w:i w:val="0"/>
               </w:rPr>
-              <w:t>Remove screw-swap / reorientation / drilling / leg-assembly steps after cut-in; re-balance line with recovered labor</w:t>
+              <w:t>Remove screw-swap / reorientation / drilling steps after cut-in; re-balance the line with the recovered labor</w:t>
             </w:r>
           </w:p>
         </w:tc>
@@ -1132,7 +943,6 @@
             <w:r>
               <w:rPr>
                 <w:b/>
-                <w:i w:val="0"/>
                 <w:color w:val="5A6672"/>
                 <w:sz w:val="17"/>
               </w:rPr>
@@ -1150,7 +960,6 @@
             <w:r>
               <w:rPr>
                 <w:b/>
-                <w:i w:val="0"/>
                 <w:color w:val="5A6672"/>
                 <w:sz w:val="17"/>
               </w:rPr>
@@ -1168,7 +977,6 @@
             <w:r>
               <w:rPr>
                 <w:b/>
-                <w:i w:val="0"/>
                 <w:color w:val="5A6672"/>
                 <w:sz w:val="17"/>
               </w:rPr>
@@ -1187,7 +995,6 @@
             <w:r>
               <w:rPr>
                 <w:b w:val="0"/>
-                <w:i w:val="0"/>
               </w:rPr>
               <w:t>B — screw swaps + reorientation</w:t>
             </w:r>
@@ -1202,7 +1009,6 @@
             <w:r>
               <w:rPr>
                 <w:b w:val="0"/>
-                <w:i w:val="0"/>
               </w:rPr>
               <w:t>~11 min 40 s</w:t>
             </w:r>
@@ -1217,7 +1023,6 @@
             <w:r>
               <w:rPr>
                 <w:b w:val="0"/>
-                <w:i w:val="0"/>
               </w:rPr>
               <w:t>Connector operator (redeploy to bottleneck)</w:t>
             </w:r>
@@ -1234,7 +1039,6 @@
             <w:r>
               <w:rPr>
                 <w:b w:val="0"/>
-                <w:i w:val="0"/>
               </w:rPr>
               <w:t>C — pre-drilled holes</w:t>
             </w:r>
@@ -1249,7 +1053,6 @@
             <w:r>
               <w:rPr>
                 <w:b w:val="0"/>
-                <w:i w:val="0"/>
               </w:rPr>
               <w:t>≥ 5 min</w:t>
             </w:r>
@@ -1264,7 +1067,6 @@
             <w:r>
               <w:rPr>
                 <w:b w:val="0"/>
-                <w:i w:val="0"/>
               </w:rPr>
               <w:t>Seat-frame bottleneck — direct throughput gain</w:t>
             </w:r>
@@ -1280,55 +1082,7 @@
             <w:r/>
             <w:r>
               <w:rPr>
-                <w:b w:val="0"/>
-                <w:i w:val="0"/>
-              </w:rPr>
-              <w:t>D — pre-assembled leg (90% of units)</w:t>
-            </w:r>
-          </w:p>
-        </w:tc>
-        <w:tc>
-          <w:tcPr>
-            <w:tcW w:type="dxa" w:w="3408"/>
-          </w:tcPr>
-          <w:p>
-            <w:r/>
-            <w:r>
-              <w:rPr>
-                <w:b w:val="0"/>
-                <w:i w:val="0"/>
-              </w:rPr>
-              <w:t>~8 min (≈7.2 blended)</w:t>
-            </w:r>
-          </w:p>
-        </w:tc>
-        <w:tc>
-          <w:tcPr>
-            <w:tcW w:type="dxa" w:w="3408"/>
-          </w:tcPr>
-          <w:p>
-            <w:r/>
-            <w:r>
-              <w:rPr>
-                <w:b w:val="0"/>
-                <w:i w:val="0"/>
-              </w:rPr>
-              <w:t>Connector operator + manufacturing/paint upstream</w:t>
-            </w:r>
-          </w:p>
-        </w:tc>
-      </w:tr>
-      <w:tr>
-        <w:tc>
-          <w:tcPr>
-            <w:tcW w:type="dxa" w:w="3408"/>
-          </w:tcPr>
-          <w:p>
-            <w:r/>
-            <w:r>
-              <w:rPr>
                 <w:b/>
-                <w:i w:val="0"/>
               </w:rPr>
               <w:t>Total</w:t>
             </w:r>
@@ -1343,9 +1097,8 @@
             <w:r>
               <w:rPr>
                 <w:b/>
-                <w:i w:val="0"/>
               </w:rPr>
-              <w:t>≈ 24 min/unit</w:t>
+              <w:t>≈ 16–18 min/unit</w:t>
             </w:r>
           </w:p>
         </w:tc>
@@ -1358,9 +1111,8 @@
             <w:r>
               <w:rPr>
                 <w:b/>
-                <w:i w:val="0"/>
               </w:rPr>
-              <w:t>Concentrated on / redeployable to the bottleneck</w:t>
+              <w:t>Every unit, compounding with volume across Meritage lines</w:t>
             </w:r>
           </w:p>
         </w:tc>
@@ -1403,7 +1155,6 @@
             <w:r>
               <w:rPr>
                 <w:b/>
-                <w:i w:val="0"/>
                 <w:color w:val="5A6672"/>
                 <w:sz w:val="17"/>
               </w:rPr>
@@ -1421,7 +1172,6 @@
             <w:r>
               <w:rPr>
                 <w:b/>
-                <w:i w:val="0"/>
                 <w:color w:val="5A6672"/>
                 <w:sz w:val="17"/>
               </w:rPr>
@@ -1440,7 +1190,6 @@
             <w:r>
               <w:rPr>
                 <w:b w:val="0"/>
-                <w:i w:val="0"/>
               </w:rPr>
               <w:t>Generic connectors in house / in transit</w:t>
             </w:r>
@@ -1455,7 +1204,6 @@
             <w:r>
               <w:rPr>
                 <w:b w:val="0"/>
-                <w:i w:val="0"/>
               </w:rPr>
               <w:t>Use as is — continue current line rework until pre-configured stock cuts in (no scrap)</w:t>
             </w:r>
@@ -1472,7 +1220,6 @@
             <w:r>
               <w:rPr>
                 <w:b w:val="0"/>
-                <w:i w:val="0"/>
               </w:rPr>
               <w:t>Screw stock 40200 / 1012934</w:t>
             </w:r>
@@ -1487,41 +1234,8 @@
             <w:r>
               <w:rPr>
                 <w:b w:val="0"/>
-                <w:i w:val="0"/>
               </w:rPr>
               <w:t>Use for service/other products if applicable; excess to be dispositioned by Supply Chain</w:t>
-            </w:r>
-          </w:p>
-        </w:tc>
-      </w:tr>
-      <w:tr>
-        <w:tc>
-          <w:tcPr>
-            <w:tcW w:type="dxa" w:w="5112"/>
-          </w:tcPr>
-          <w:p>
-            <w:r/>
-            <w:r>
-              <w:rPr>
-                <w:b w:val="0"/>
-                <w:i w:val="0"/>
-              </w:rPr>
-              <w:t>Leg-piece components in house</w:t>
-            </w:r>
-          </w:p>
-        </w:tc>
-        <w:tc>
-          <w:tcPr>
-            <w:tcW w:type="dxa" w:w="5112"/>
-          </w:tcPr>
-          <w:p>
-            <w:r/>
-            <w:r>
-              <w:rPr>
-                <w:b w:val="0"/>
-                <w:i w:val="0"/>
-              </w:rPr>
-              <w:t>Consume through cut-in of pre-assembled part</w:t>
             </w:r>
           </w:p>
         </w:tc>
@@ -1549,7 +1263,7 @@
         <w:spacing w:after="40"/>
       </w:pPr>
       <w:r>
-        <w:t>Screw spec validation: 1012919 and 40204 are what operators use today and are confirmed to work — a working baseline, not a validated spec. Engineering to confirm optimal spec before formalizing in the BOM.</w:t>
+        <w:t>Screw spec validation: 1012919 and 40204 are what operators use today and are confirmed to work — a working baseline, not a validated spec. Engineering to confirm the optimal spec before formalizing in the BOM.</w:t>
       </w:r>
     </w:p>
     <w:p>
@@ -1558,7 +1272,7 @@
         <w:spacing w:after="40"/>
       </w:pPr>
       <w:r>
-        <w:t>Paint spec (Item D): confirm the supplier can deliver the basic leg piece finished to TUUCI paint spec through the Vietnam supply chain. This is the gate on Item D.</w:t>
+        <w:t>Hole spec (Item C): Engineering to formalize drill size and positions on the updated connector drawings.</w:t>
       </w:r>
     </w:p>
     <w:p>
@@ -1567,7 +1281,7 @@
         <w:spacing w:after="40"/>
       </w:pPr>
       <w:r>
-        <w:t>Hole spec (Item C): engineering to formalize drill size and positions on the updated connector drawings.</w:t>
+        <w:t>Effectivity plan: define cut-in (PO number / lot) and dual-stock handling during the transition.</w:t>
       </w:r>
     </w:p>
     <w:p>
@@ -1576,7 +1290,7 @@
         <w:spacing w:after="40"/>
       </w:pPr>
       <w:r>
-        <w:t>Effectivity plan: define cut-in (PO number / lot) and dual-stock handling during transition.</w:t>
+        <w:t>Supplier confirmation: Vietnam supplier to confirm capability and any cost/lead-time impact of pre-fitting screws and pre-drilling.</w:t>
       </w:r>
     </w:p>
     <w:p>
@@ -1601,7 +1315,7 @@
         <w:spacing w:after="40"/>
       </w:pPr>
       <w:r>
-        <w:t>Approve BOM correction (Item A) — enables everything downstream</w:t>
+        <w:t>Approve the BOM correction (Item A) — it enables everything downstream</w:t>
       </w:r>
     </w:p>
     <w:p>
@@ -1610,7 +1324,7 @@
         <w:spacing w:after="40"/>
       </w:pPr>
       <w:r>
-        <w:t>Release updated connector drawings (P/Ns, screws, orientation, holes)</w:t>
+        <w:t>Release updated connector drawings (P/Ns, configurations, screw callouts, hole spec)</w:t>
       </w:r>
     </w:p>
     <w:p>
@@ -1619,7 +1333,7 @@
         <w:spacing w:after="40"/>
       </w:pPr>
       <w:r>
-        <w:t>Supplier changeover: pre-configured connectors + pre-drilled holes (Items B/C); qualify leg paint and cut in Item D</w:t>
+        <w:t>Supplier changeover: pre-configured, pre-drilled connectors (Items B and C) on the next PO</w:t>
       </w:r>
     </w:p>
     <w:p>
@@ -1628,7 +1342,19 @@
         <w:spacing w:after="40"/>
       </w:pPr>
       <w:r>
-        <w:t>Re-balance the cell to takt with the recovered labor; update SWIs</w:t>
+        <w:t>Re-balance the cell to takt with the recovered labor; update the SWIs</w:t>
+      </w:r>
+    </w:p>
+    <w:p>
+      <w:pPr>
+        <w:spacing w:after="120"/>
+      </w:pPr>
+      <w:r>
+        <w:rPr>
+          <w:color w:val="5A6672"/>
+          <w:sz w:val="18"/>
+        </w:rPr>
+        <w:t>Out of scope (planned as a follow-on ECN): receiving the high-volume basic leg piece pre-assembled (~8 min/unit additional), pending paint-spec qualification with the supplier.</w:t>
       </w:r>
     </w:p>
     <w:p>
@@ -1670,7 +1396,6 @@
             <w:r>
               <w:rPr>
                 <w:b/>
-                <w:i w:val="0"/>
                 <w:color w:val="5A6672"/>
                 <w:sz w:val="17"/>
               </w:rPr>
@@ -1688,7 +1413,6 @@
             <w:r>
               <w:rPr>
                 <w:b/>
-                <w:i w:val="0"/>
                 <w:color w:val="5A6672"/>
                 <w:sz w:val="17"/>
               </w:rPr>
@@ -1706,7 +1430,6 @@
             <w:r>
               <w:rPr>
                 <w:b/>
-                <w:i w:val="0"/>
                 <w:color w:val="5A6672"/>
                 <w:sz w:val="17"/>
               </w:rPr>
@@ -1724,7 +1447,6 @@
             <w:r>
               <w:rPr>
                 <w:b/>
-                <w:i w:val="0"/>
                 <w:color w:val="5A6672"/>
                 <w:sz w:val="17"/>
               </w:rPr>
@@ -1746,7 +1468,6 @@
             <w:r>
               <w:rPr>
                 <w:b w:val="0"/>
-                <w:i w:val="0"/>
               </w:rPr>
               <w:t>Originator — Continuous Improvement</w:t>
             </w:r>
@@ -1761,7 +1482,6 @@
             <w:r>
               <w:rPr>
                 <w:b w:val="0"/>
-                <w:i w:val="0"/>
               </w:rPr>
               <w:t>Douglas O'Keefe</w:t>
             </w:r>
@@ -1793,7 +1513,6 @@
             <w:r>
               <w:rPr>
                 <w:b w:val="0"/>
-                <w:i w:val="0"/>
               </w:rPr>
               <w:t>Engineering</w:t>
             </w:r>
@@ -1808,7 +1527,6 @@
             <w:r>
               <w:rPr>
                 <w:b w:val="0"/>
-                <w:i w:val="0"/>
               </w:rPr>
             </w:r>
           </w:p>
@@ -1839,7 +1557,6 @@
             <w:r>
               <w:rPr>
                 <w:b w:val="0"/>
-                <w:i w:val="0"/>
               </w:rPr>
               <w:t>Supply Chain / Purchasing</w:t>
             </w:r>
@@ -1854,7 +1571,6 @@
             <w:r>
               <w:rPr>
                 <w:b w:val="0"/>
-                <w:i w:val="0"/>
               </w:rPr>
             </w:r>
           </w:p>
@@ -1885,7 +1601,6 @@
             <w:r>
               <w:rPr>
                 <w:b w:val="0"/>
-                <w:i w:val="0"/>
               </w:rPr>
               <w:t>Quality</w:t>
             </w:r>
@@ -1900,7 +1615,6 @@
             <w:r>
               <w:rPr>
                 <w:b w:val="0"/>
-                <w:i w:val="0"/>
               </w:rPr>
             </w:r>
           </w:p>
@@ -1931,7 +1645,6 @@
             <w:r>
               <w:rPr>
                 <w:b w:val="0"/>
-                <w:i w:val="0"/>
               </w:rPr>
               <w:t>Production</w:t>
             </w:r>
@@ -1946,7 +1659,6 @@
             <w:r>
               <w:rPr>
                 <w:b w:val="0"/>
-                <w:i w:val="0"/>
               </w:rPr>
             </w:r>
           </w:p>
@@ -1971,11 +1683,10 @@
       </w:pPr>
       <w:r>
         <w:rPr>
-          <w:i w:val="0"/>
           <w:color w:val="5A6672"/>
           <w:sz w:val="18"/>
         </w:rPr>
-        <w:t>References: Meritage 3-Seater Engineering Improvement Plan (O'Keefe, 06/18/2026) · Seat-frame assembly drawing (shows 1015301 ×2 / 1015302 / 1016592) · TU-530 Rev A 'Seat, MER, Ottoman No Arms Subassy' (BOMs Config 1/2/3 connector assemblies separately) · Connector CAD drawings currently marked 1012553.</w:t>
+        <w:t>References: Meritage 3-Seater Engineering Improvement Plan (O'Keefe, 06/18/2026) · Seat-frame assembly drawing (shows 1015301 ×2 / 1015302 / 1016592) · TU-530 Rev A 'Seat, MER, Ottoman No Arms Subassy' (BOMs the Config 1/2/3 connector assemblies separately) · Connector CAD drawings currently marked 1012553.</w:t>
       </w:r>
     </w:p>
     <w:sectPr>

</xml_diff>